<commit_message>
clean up week 5 submission: remove fluff and keep clean code with minimal student descriptions
</commit_message>
<xml_diff>
--- a/submissions/Muhammad_Tayyab_023-24-0118_Week_05_Lab_Submission.docx
+++ b/submissions/Muhammad_Tayyab_023-24-0118_Week_05_Lab_Submission.docx
@@ -71,7 +71,7 @@
           <w:color w:val="505050"/>
           <w:sz w:val="22"/>
         </w:rPr>
-        <w:t>Pure Node.js, Variables, Scoping, Array Pipelines, Objects &amp; Validated Bill Calculator</w:t>
+        <w:t>Pure Node.js, Variables, Functions, Arrays, Objects &amp; Tip Calculator</w:t>
       </w:r>
     </w:p>
     <w:tbl>
@@ -415,7 +415,7 @@
           <w:color w:val="0A0A0A"/>
           <w:sz w:val="22"/>
         </w:rPr>
-        <w:t>1. Warm-up: Quick Recall (warmup.js)</w:t>
+        <w:t>1. Warm-up (warmup.js)</w:t>
       </w:r>
     </w:p>
     <w:p>
@@ -428,33 +428,7 @@
           <w:color w:val="1E1E1E"/>
           <w:sz w:val="19"/>
         </w:rPr>
-        <w:t>I created warmup.js to verify Node.js setup and run pure JavaScript from the command line.</w:t>
-      </w:r>
-    </w:p>
-    <w:p>
-      <w:pPr>
-        <w:spacing w:before="0" w:after="80" w:line="276" w:lineRule="auto"/>
-      </w:pPr>
-      <w:r>
-        <w:rPr>
-          <w:rFonts w:ascii="Helvetica" w:hAnsi="Helvetica"/>
-          <w:color w:val="1E1E1E"/>
-          <w:sz w:val="19"/>
-        </w:rPr>
-        <w:t>Declared const name = 'Muhammad Tayyab' and let score = 0.</w:t>
-      </w:r>
-    </w:p>
-    <w:p>
-      <w:pPr>
-        <w:spacing w:before="0" w:after="80" w:line="276" w:lineRule="auto"/>
-      </w:pPr>
-      <w:r>
-        <w:rPr>
-          <w:rFonts w:ascii="Helvetica" w:hAnsi="Helvetica"/>
-          <w:color w:val="1E1E1E"/>
-          <w:sz w:val="19"/>
-        </w:rPr>
-        <w:t>Created function double(n) returning n * 2 and logged the second element of a skills array.</w:t>
+        <w:t>Declared const for name, let for score, double(n) function, and logged the 2nd array item.</w:t>
       </w:r>
     </w:p>
     <w:p>
@@ -502,23 +476,26 @@
                 <w:color w:val="141414"/>
                 <w:sz w:val="16"/>
               </w:rPr>
-              <w:t>// warmup.js</w:t>
-              <w:br/>
               <w:t>const name = "Muhammad Tayyab";</w:t>
               <w:br/>
               <w:t>let score = 0;</w:t>
               <w:br/>
-              <w:t>function double(n) { return n * 2; }</w:t>
-              <w:br/>
-              <w:t>const skills = ["JavaScript", "CSS Layout", "HTML5 Semantics"];</w:t>
-              <w:br/>
-              <w:t>console.log(`Student Name: ${name}`);</w:t>
-              <w:br/>
-              <w:t>console.log(`Initial Score: ${score}`);</w:t>
-              <w:br/>
-              <w:t>console.log(`Double of 21: ${double(21)}`);</w:t>
-              <w:br/>
-              <w:t>console.log(`Second Skill: ${skills[1]}`);</w:t>
+              <w:br/>
+              <w:t>function double(n) {</w:t>
+              <w:br/>
+              <w:t xml:space="preserve">    return n * 2;</w:t>
+              <w:br/>
+              <w:t>}</w:t>
+              <w:br/>
+              <w:br/>
+              <w:t>const skills = ["JavaScript", "CSS", "HTML"];</w:t>
+              <w:br/>
+              <w:br/>
+              <w:t>console.log("Name:", name, "| Score:", score);</w:t>
+              <w:br/>
+              <w:t>console.log("Double 21:", double(21));</w:t>
+              <w:br/>
+              <w:t>console.log("Second skill:", skills[1]);</w:t>
             </w:r>
           </w:p>
         </w:tc>
@@ -541,7 +518,7 @@
           <w:color w:val="0A0A0A"/>
           <w:sz w:val="22"/>
         </w:rPr>
-        <w:t>2. Class Activity A: const / let / === Drill (basics.js)</w:t>
+        <w:t>2. Class Activities A, B &amp; C (basics.js)</w:t>
       </w:r>
     </w:p>
     <w:p>
@@ -554,46 +531,7 @@
           <w:color w:val="1E1E1E"/>
           <w:sz w:val="19"/>
         </w:rPr>
-        <w:t>I analyzed variable mutability, scope, and abstract vs strict equality.</w:t>
-      </w:r>
-    </w:p>
-    <w:p>
-      <w:pPr>
-        <w:spacing w:before="0" w:after="80" w:line="276" w:lineRule="auto"/>
-      </w:pPr>
-      <w:r>
-        <w:rPr>
-          <w:rFonts w:ascii="Helvetica" w:hAnsi="Helvetica"/>
-          <w:color w:val="1E1E1E"/>
-          <w:sz w:val="19"/>
-        </w:rPr>
-        <w:t>Reassigning a const variable (course = 'Other') threw TypeError: Assignment to constant variable.</w:t>
-      </w:r>
-    </w:p>
-    <w:p>
-      <w:pPr>
-        <w:spacing w:before="0" w:after="80" w:line="276" w:lineRule="auto"/>
-      </w:pPr>
-      <w:r>
-        <w:rPr>
-          <w:rFonts w:ascii="Helvetica" w:hAnsi="Helvetica"/>
-          <w:color w:val="1E1E1E"/>
-          <w:sz w:val="19"/>
-        </w:rPr>
-        <w:t>let count = 0 was incremented twice to 2.</w:t>
-      </w:r>
-    </w:p>
-    <w:p>
-      <w:pPr>
-        <w:spacing w:before="0" w:after="80" w:line="276" w:lineRule="auto"/>
-      </w:pPr>
-      <w:r>
-        <w:rPr>
-          <w:rFonts w:ascii="Helvetica" w:hAnsi="Helvetica"/>
-          <w:color w:val="1E1E1E"/>
-          <w:sz w:val="19"/>
-        </w:rPr>
-        <w:t>Evaluated loose vs strict equality: 0 == false is true (coercion to 0), 0 === false is false (different types), and [] == false is true ([] -&gt; '' -&gt; 0).</w:t>
+        <w:t>Tested const reassignment error, let increments, loose vs strict equality (0 == false is true, 0 === false is false, [] == false is true). Wrote helper functions getInitials, isPalindrome, countWords, letterGrade, and displayCount with ?? operator.</w:t>
       </w:r>
     </w:p>
     <w:p>
@@ -606,7 +544,7 @@
           <w:color w:val="505050"/>
           <w:sz w:val="16"/>
         </w:rPr>
-        <w:t>File: Week 5/basics.js (Activity A)</w:t>
+        <w:t>File: Week 5/basics.js</w:t>
       </w:r>
     </w:p>
     <w:tbl>
@@ -641,19 +579,98 @@
                 <w:color w:val="141414"/>
                 <w:sz w:val="16"/>
               </w:rPr>
-              <w:t>// basics.js - Activity A</w:t>
+              <w:t>// Class Activity A</w:t>
               <w:br/>
               <w:t>const course = "Web Eng";</w:t>
               <w:br/>
-              <w:t>try { course = "Other"; } catch (err) { console.log(err.message); }</w:t>
-              <w:br/>
-              <w:t>let count = 0; count++; count++;</w:t>
-              <w:br/>
-              <w:t>console.log(0 == false);  // true</w:t>
-              <w:br/>
-              <w:t>console.log(0 === false); // false</w:t>
-              <w:br/>
-              <w:t>console.log([] == false); // true</w:t>
+              <w:t>try {</w:t>
+              <w:br/>
+              <w:t xml:space="preserve">    course = "Other";</w:t>
+              <w:br/>
+              <w:t>} catch (e) {</w:t>
+              <w:br/>
+              <w:t xml:space="preserve">    console.log("Cannot reassign const:", e.message);</w:t>
+              <w:br/>
+              <w:t>}</w:t>
+              <w:br/>
+              <w:br/>
+              <w:t>let count = 0;</w:t>
+              <w:br/>
+              <w:t>count++;</w:t>
+              <w:br/>
+              <w:t>count++;</w:t>
+              <w:br/>
+              <w:t>console.log("Count:", count);</w:t>
+              <w:br/>
+              <w:br/>
+              <w:t>// 0 == false is true because loose equality converts false to 0</w:t>
+              <w:br/>
+              <w:t>console.log(0 == false);</w:t>
+              <w:br/>
+              <w:t>// 0 === false is false because types differ (number vs boolean)</w:t>
+              <w:br/>
+              <w:t>console.log(0 === false);</w:t>
+              <w:br/>
+              <w:t>// [] == false is true because [] converts to "" then to 0</w:t>
+              <w:br/>
+              <w:t>console.log([] == false);</w:t>
+              <w:br/>
+              <w:br/>
+              <w:t>// Class Activity B</w:t>
+              <w:br/>
+              <w:t>const getInitials = (name) =&gt;</w:t>
+              <w:br/>
+              <w:t xml:space="preserve">    name.trim().split(/\s+/).map((w) =&gt; w[0].toUpperCase()).join("");</w:t>
+              <w:br/>
+              <w:br/>
+              <w:t>const isPalindrome = (str) =&gt; {</w:t>
+              <w:br/>
+              <w:t xml:space="preserve">    const s = str.toLowerCase().replace(/[^a-z0-9]/g, "");</w:t>
+              <w:br/>
+              <w:t xml:space="preserve">    return s.length &gt; 0 &amp;&amp; s === s.split("").reverse().join("");</w:t>
+              <w:br/>
+              <w:t>};</w:t>
+              <w:br/>
+              <w:br/>
+              <w:t>const countWords = (str) =&gt;</w:t>
+              <w:br/>
+              <w:t xml:space="preserve">    str.trim() === "" ? 0 : str.trim().split(/\s+/).length;</w:t>
+              <w:br/>
+              <w:br/>
+              <w:t>console.log("Initials:", getInitials("Ayesha Khan"));</w:t>
+              <w:br/>
+              <w:t>console.log("Palindrome:", isPalindrome("Race car"));</w:t>
+              <w:br/>
+              <w:t>console.log("Word count:", countWords("the quick brown fox"));</w:t>
+              <w:br/>
+              <w:br/>
+              <w:t>// Class Activity C</w:t>
+              <w:br/>
+              <w:t>const letterGrade = (score) =&gt; {</w:t>
+              <w:br/>
+              <w:t xml:space="preserve">    if (score &gt;= 90) return "A";</w:t>
+              <w:br/>
+              <w:t xml:space="preserve">    if (score &gt;= 80) return "B";</w:t>
+              <w:br/>
+              <w:t xml:space="preserve">    if (score &gt;= 70) return "C";</w:t>
+              <w:br/>
+              <w:t xml:space="preserve">    if (score &gt;= 60) return "D";</w:t>
+              <w:br/>
+              <w:t xml:space="preserve">    return "F";</w:t>
+              <w:br/>
+              <w:t>};</w:t>
+              <w:br/>
+              <w:br/>
+              <w:t>const displayCount = (n) =&gt; n ?? "N/A";</w:t>
+              <w:br/>
+              <w:br/>
+              <w:t>console.log("Grade 85:", letterGrade(85));</w:t>
+              <w:br/>
+              <w:t>console.log("displayCount(0):", displayCount(0));</w:t>
+              <w:br/>
+              <w:t>console.log("displayCount(null):", displayCount(null));</w:t>
+              <w:br/>
+              <w:t>console.log("displayCount(42):", displayCount(42));</w:t>
             </w:r>
           </w:p>
         </w:tc>
@@ -676,7 +693,7 @@
           <w:color w:val="0A0A0A"/>
           <w:sz w:val="22"/>
         </w:rPr>
-        <w:t>3. Class Activity B: String Utilities &amp; Arrow Functions (basics.js)</w:t>
+        <w:t>3. Class Activity D: Students Pipeline (arrays.js)</w:t>
       </w:r>
     </w:p>
     <w:p>
@@ -689,286 +706,7 @@
           <w:color w:val="1E1E1E"/>
           <w:sz w:val="19"/>
         </w:rPr>
-        <w:t>Implemented three utility tools using arrow functions and regex:</w:t>
-      </w:r>
-    </w:p>
-    <w:p>
-      <w:pPr>
-        <w:spacing w:before="0" w:after="80" w:line="276" w:lineRule="auto"/>
-      </w:pPr>
-      <w:r>
-        <w:rPr>
-          <w:rFonts w:ascii="Helvetica" w:hAnsi="Helvetica"/>
-          <w:color w:val="1E1E1E"/>
-          <w:sz w:val="19"/>
-        </w:rPr>
-        <w:t>getInitials('Ayesha Khan') -&gt; 'AK' by splitting words and taking uppercase initials.</w:t>
-      </w:r>
-    </w:p>
-    <w:p>
-      <w:pPr>
-        <w:spacing w:before="0" w:after="80" w:line="276" w:lineRule="auto"/>
-      </w:pPr>
-      <w:r>
-        <w:rPr>
-          <w:rFonts w:ascii="Helvetica" w:hAnsi="Helvetica"/>
-          <w:color w:val="1E1E1E"/>
-          <w:sz w:val="19"/>
-        </w:rPr>
-        <w:t>isPalindrome('Race car') -&gt; true by stripping spaces/punctuation, lowercasing, and reversing.</w:t>
-      </w:r>
-    </w:p>
-    <w:p>
-      <w:pPr>
-        <w:spacing w:before="0" w:after="80" w:line="276" w:lineRule="auto"/>
-      </w:pPr>
-      <w:r>
-        <w:rPr>
-          <w:rFonts w:ascii="Helvetica" w:hAnsi="Helvetica"/>
-          <w:color w:val="1E1E1E"/>
-          <w:sz w:val="19"/>
-        </w:rPr>
-        <w:t>countWords('the quick brown fox') -&gt; 4 by trimming and splitting on whitespace.</w:t>
-      </w:r>
-    </w:p>
-    <w:p>
-      <w:pPr>
-        <w:spacing w:before="80" w:after="20"/>
-      </w:pPr>
-      <w:r>
-        <w:rPr>
-          <w:b/>
-          <w:color w:val="505050"/>
-          <w:sz w:val="16"/>
-        </w:rPr>
-        <w:t>File: Week 5/basics.js (Activity B)</w:t>
-      </w:r>
-    </w:p>
-    <w:tbl>
-      <w:tblPr>
-        <w:tblW w:type="auto" w:w="0"/>
-        <w:jc w:val="center"/>
-        <w:tblLayout w:type="fixed"/>
-        <w:tblLook w:firstColumn="1" w:firstRow="1" w:lastColumn="0" w:lastRow="0" w:noHBand="0" w:noVBand="1" w:val="04A0"/>
-      </w:tblPr>
-      <w:tblGrid>
-        <w:gridCol w:w="10800"/>
-      </w:tblGrid>
-      <w:tr>
-        <w:tc>
-          <w:tcPr>
-            <w:tcW w:type="dxa" w:w="9360"/>
-            <w:shd w:fill="F5F5F5"/>
-            <w:tcMar>
-              <w:top w:w="80" w:type="dxa"/>
-              <w:bottom w:w="80" w:type="dxa"/>
-              <w:left w:w="120" w:type="dxa"/>
-              <w:right w:w="120" w:type="dxa"/>
-            </w:tcMar>
-          </w:tcPr>
-          <w:p>
-            <w:pPr>
-              <w:spacing w:before="0" w:after="0" w:line="252" w:lineRule="auto"/>
-            </w:pPr>
-            <w:r>
-              <w:rPr>
-                <w:rFonts w:ascii="Courier New" w:hAnsi="Courier New"/>
-                <w:color w:val="141414"/>
-                <w:sz w:val="16"/>
-              </w:rPr>
-              <w:t>// basics.js - Activity B</w:t>
-              <w:br/>
-              <w:t>const getInitials = (str) =&gt; str.trim().split(/\s+/).map(w =&gt; w[0].toUpperCase()).join("");</w:t>
-              <w:br/>
-              <w:t>const isPalindrome = (str) =&gt; {</w:t>
-              <w:br/>
-              <w:t xml:space="preserve">    const c = str.toLowerCase().replace(/[^a-z0-9]/g, "");</w:t>
-              <w:br/>
-              <w:t xml:space="preserve">    return c.length &gt; 0 &amp;&amp; c === c.split("").reverse().join("");</w:t>
-              <w:br/>
-              <w:t>};</w:t>
-              <w:br/>
-              <w:t>const countWords = (s) =&gt; s.trim().length === 0 ? 0 : s.trim().split(/\s+/).length;</w:t>
-            </w:r>
-          </w:p>
-        </w:tc>
-      </w:tr>
-    </w:tbl>
-    <w:p>
-      <w:pPr>
-        <w:spacing w:after="80"/>
-      </w:pPr>
-    </w:p>
-    <w:p>
-      <w:pPr>
-        <w:keepNext/>
-        <w:spacing w:before="240" w:after="80"/>
-      </w:pPr>
-      <w:r>
-        <w:rPr>
-          <w:rFonts w:ascii="Helvetica" w:hAnsi="Helvetica"/>
-          <w:b/>
-          <w:color w:val="0A0A0A"/>
-          <w:sz w:val="22"/>
-        </w:rPr>
-        <w:t>4. Class Activity C: Conditionals &amp; Nullish Coalescing (basics.js)</w:t>
-      </w:r>
-    </w:p>
-    <w:p>
-      <w:pPr>
-        <w:spacing w:before="0" w:after="80" w:line="276" w:lineRule="auto"/>
-      </w:pPr>
-      <w:r>
-        <w:rPr>
-          <w:rFonts w:ascii="Helvetica" w:hAnsi="Helvetica"/>
-          <w:color w:val="1E1E1E"/>
-          <w:sz w:val="19"/>
-        </w:rPr>
-        <w:t>Built letterGrade(score) for standard letter grading (A to F) with if / else if.</w:t>
-      </w:r>
-    </w:p>
-    <w:p>
-      <w:pPr>
-        <w:spacing w:before="0" w:after="80" w:line="276" w:lineRule="auto"/>
-      </w:pPr>
-      <w:r>
-        <w:rPr>
-          <w:rFonts w:ascii="Helvetica" w:hAnsi="Helvetica"/>
-          <w:color w:val="1E1E1E"/>
-          <w:sz w:val="19"/>
-        </w:rPr>
-        <w:t>Built displayCount(n) using the nullish coalescing operator (??). Tested with 0, null, and 42. Proved that displayCount(0) returns 0, whereas logical OR (||) would have incorrectly fallen back to a default value.</w:t>
-      </w:r>
-    </w:p>
-    <w:p>
-      <w:pPr>
-        <w:spacing w:before="80" w:after="20"/>
-      </w:pPr>
-      <w:r>
-        <w:rPr>
-          <w:b/>
-          <w:color w:val="505050"/>
-          <w:sz w:val="16"/>
-        </w:rPr>
-        <w:t>File: Week 5/basics.js (Activity C)</w:t>
-      </w:r>
-    </w:p>
-    <w:tbl>
-      <w:tblPr>
-        <w:tblW w:type="auto" w:w="0"/>
-        <w:jc w:val="center"/>
-        <w:tblLayout w:type="fixed"/>
-        <w:tblLook w:firstColumn="1" w:firstRow="1" w:lastColumn="0" w:lastRow="0" w:noHBand="0" w:noVBand="1" w:val="04A0"/>
-      </w:tblPr>
-      <w:tblGrid>
-        <w:gridCol w:w="10800"/>
-      </w:tblGrid>
-      <w:tr>
-        <w:tc>
-          <w:tcPr>
-            <w:tcW w:type="dxa" w:w="9360"/>
-            <w:shd w:fill="F5F5F5"/>
-            <w:tcMar>
-              <w:top w:w="80" w:type="dxa"/>
-              <w:bottom w:w="80" w:type="dxa"/>
-              <w:left w:w="120" w:type="dxa"/>
-              <w:right w:w="120" w:type="dxa"/>
-            </w:tcMar>
-          </w:tcPr>
-          <w:p>
-            <w:pPr>
-              <w:spacing w:before="0" w:after="0" w:line="252" w:lineRule="auto"/>
-            </w:pPr>
-            <w:r>
-              <w:rPr>
-                <w:rFonts w:ascii="Courier New" w:hAnsi="Courier New"/>
-                <w:color w:val="141414"/>
-                <w:sz w:val="16"/>
-              </w:rPr>
-              <w:t>// basics.js - Activity C</w:t>
-              <w:br/>
-              <w:t>const displayCount = (n) =&gt; n ?? "No count provided";</w:t>
-              <w:br/>
-              <w:t>console.log(displayCount(0));    // 0 (preserved)</w:t>
-              <w:br/>
-              <w:t>console.log(displayCount(null)); // "No count provided"</w:t>
-              <w:br/>
-              <w:t>console.log(displayCount(42));   // 42</w:t>
-            </w:r>
-          </w:p>
-        </w:tc>
-      </w:tr>
-    </w:tbl>
-    <w:p>
-      <w:pPr>
-        <w:spacing w:after="80"/>
-      </w:pPr>
-    </w:p>
-    <w:p>
-      <w:pPr>
-        <w:keepNext/>
-        <w:spacing w:before="240" w:after="80"/>
-      </w:pPr>
-      <w:r>
-        <w:rPr>
-          <w:rFonts w:ascii="Helvetica" w:hAnsi="Helvetica"/>
-          <w:b/>
-          <w:color w:val="0A0A0A"/>
-          <w:sz w:val="22"/>
-        </w:rPr>
-        <w:t>5. Class Activity D: Students Pipeline with Array Methods (arrays.js)</w:t>
-      </w:r>
-    </w:p>
-    <w:p>
-      <w:pPr>
-        <w:spacing w:before="0" w:after="80" w:line="276" w:lineRule="auto"/>
-      </w:pPr>
-      <w:r>
-        <w:rPr>
-          <w:rFonts w:ascii="Helvetica" w:hAnsi="Helvetica"/>
-          <w:color w:val="1E1E1E"/>
-          <w:sz w:val="19"/>
-        </w:rPr>
-        <w:t>Processed student datasets using non-mutating functional array methods:</w:t>
-      </w:r>
-    </w:p>
-    <w:p>
-      <w:pPr>
-        <w:spacing w:before="0" w:after="80" w:line="276" w:lineRule="auto"/>
-      </w:pPr>
-      <w:r>
-        <w:rPr>
-          <w:rFonts w:ascii="Helvetica" w:hAnsi="Helvetica"/>
-          <w:color w:val="1E1E1E"/>
-          <w:sz w:val="19"/>
-        </w:rPr>
-        <w:t>Calculated class average using reduce (76.33). Filtered students scoring above class average using filter and mapped names: ['Ali', 'Sara', 'Zainab', 'Bilal'].</w:t>
-      </w:r>
-    </w:p>
-    <w:p>
-      <w:pPr>
-        <w:spacing w:before="0" w:after="80" w:line="276" w:lineRule="auto"/>
-      </w:pPr>
-      <w:r>
-        <w:rPr>
-          <w:rFonts w:ascii="Helvetica" w:hAnsi="Helvetica"/>
-          <w:color w:val="1E1E1E"/>
-          <w:sz w:val="19"/>
-        </w:rPr>
-        <w:t>Used students.some(s =&gt; s.score &gt; 90) (true) and students.every(s =&gt; s.score &gt; 40) (true).</w:t>
-      </w:r>
-    </w:p>
-    <w:p>
-      <w:pPr>
-        <w:spacing w:before="0" w:after="80" w:line="276" w:lineRule="auto"/>
-      </w:pPr>
-      <w:r>
-        <w:rPr>
-          <w:rFonts w:ascii="Helvetica" w:hAnsi="Helvetica"/>
-          <w:color w:val="1E1E1E"/>
-          <w:sz w:val="19"/>
-        </w:rPr>
-        <w:t>Sorted a non-mutating copy high to low using [...students].sort((a, b) =&gt; b.score - a.score), confirming the original list stayed in initial order.</w:t>
+        <w:t>Used reduce for class average, filter and map for students above average, some and every checks, and sorted a copy without mutating the original array.</w:t>
       </w:r>
     </w:p>
     <w:p>
@@ -1016,17 +754,53 @@
                 <w:color w:val="141414"/>
                 <w:sz w:val="16"/>
               </w:rPr>
-              <w:t>// arrays.js - Activity D</w:t>
-              <w:br/>
-              <w:t>const avg = students.reduce((acc, s) =&gt; acc + s.score, 0) / students.length;</w:t>
-              <w:br/>
-              <w:t>const aboveAvg = students.filter(s =&gt; s.score &gt; avg).map(s =&gt; s.name);</w:t>
-              <w:br/>
-              <w:t>const hasTop = students.some(s =&gt; s.score &gt; 90);</w:t>
-              <w:br/>
-              <w:t>const allPass = students.every(s =&gt; s.score &gt; 40);</w:t>
+              <w:t>// Class Activity D</w:t>
+              <w:br/>
+              <w:t>const students = [</w:t>
+              <w:br/>
+              <w:t xml:space="preserve">    { name: "Ali", score: 82 },</w:t>
+              <w:br/>
+              <w:t xml:space="preserve">    { name: "Sara", score: 95 },</w:t>
+              <w:br/>
+              <w:t xml:space="preserve">    { name: "Ahmed", score: 68 },</w:t>
+              <w:br/>
+              <w:t xml:space="preserve">    { name: "Zainab", score: 77 },</w:t>
+              <w:br/>
+              <w:t xml:space="preserve">    { name: "Bilal", score: 91 },</w:t>
+              <w:br/>
+              <w:t xml:space="preserve">    { name: "Hamza", score: 45 }</w:t>
+              <w:br/>
+              <w:t>];</w:t>
+              <w:br/>
+              <w:br/>
+              <w:t>// 1. Above average names</w:t>
+              <w:br/>
+              <w:t>const total = students.reduce((sum, s) =&gt; sum + s.score, 0);</w:t>
+              <w:br/>
+              <w:t>const avg = total / students.length;</w:t>
+              <w:br/>
+              <w:t>const aboveAvg = students.filter((s) =&gt; s.score &gt; avg).map((s) =&gt; s.name);</w:t>
+              <w:br/>
+              <w:br/>
+              <w:t>console.log("Class Average:", avg.toFixed(2));</w:t>
+              <w:br/>
+              <w:t>console.log("Above average students:", aboveAvg);</w:t>
+              <w:br/>
+              <w:br/>
+              <w:t>// 2. some &amp; every</w:t>
+              <w:br/>
+              <w:t>console.log("Any score &gt; 90:", students.some((s) =&gt; s.score &gt; 90));</w:t>
+              <w:br/>
+              <w:t>console.log("All scores &gt; 40:", students.every((s) =&gt; s.score &gt; 40));</w:t>
+              <w:br/>
+              <w:br/>
+              <w:t>// 3. Sort high to low without mutating original</w:t>
               <w:br/>
               <w:t>const sorted = [...students].sort((a, b) =&gt; b.score - a.score);</w:t>
+              <w:br/>
+              <w:t>console.log("Sorted:", sorted);</w:t>
+              <w:br/>
+              <w:t>console.log("Original untouched:", students[0].name === "Ali");</w:t>
             </w:r>
           </w:p>
         </w:tc>
@@ -1049,7 +823,7 @@
           <w:color w:val="0A0A0A"/>
           <w:sz w:val="22"/>
         </w:rPr>
-        <w:t>6. Class Activity E: Objects &amp; groupBy via reduce (objects.js)</w:t>
+        <w:t>4. Class Activity E: Products &amp; groupBy (objects.js)</w:t>
       </w:r>
     </w:p>
     <w:p>
@@ -1062,20 +836,7 @@
           <w:color w:val="1E1E1E"/>
           <w:sz w:val="19"/>
         </w:rPr>
-        <w:t>Extracted available product titles using filter and map, and calculated aggregate inventory cost using reduce (PKR 300).</w:t>
-      </w:r>
-    </w:p>
-    <w:p>
-      <w:pPr>
-        <w:spacing w:before="0" w:after="80" w:line="276" w:lineRule="auto"/>
-      </w:pPr>
-      <w:r>
-        <w:rPr>
-          <w:rFonts w:ascii="Helvetica" w:hAnsi="Helvetica"/>
-          <w:color w:val="1E1E1E"/>
-          <w:sz w:val="19"/>
-        </w:rPr>
-        <w:t>Wrote a reusable groupBy(products, 'category') function with reduce that buckets objects into category arrays without mutation.</w:t>
+        <w:t>Filtered inStock products, calculated total price using reduce, and wrote groupBy using reduce to group products by category.</w:t>
       </w:r>
     </w:p>
     <w:p>
@@ -1123,19 +884,55 @@
                 <w:color w:val="141414"/>
                 <w:sz w:val="16"/>
               </w:rPr>
-              <w:t>// objects.js - Activity E</w:t>
-              <w:br/>
-              <w:t>const groupBy = (items, key) =&gt; items.reduce((acc, item) =&gt; {</w:t>
-              <w:br/>
-              <w:t xml:space="preserve">    const k = item[key];</w:t>
-              <w:br/>
-              <w:t xml:space="preserve">    if (!acc[k]) acc[k] = [];</w:t>
-              <w:br/>
-              <w:t xml:space="preserve">    acc[k].push(item);</w:t>
-              <w:br/>
-              <w:t xml:space="preserve">    return acc;</w:t>
-              <w:br/>
-              <w:t>}, {});</w:t>
+              <w:t>// Class Activity E</w:t>
+              <w:br/>
+              <w:t>const products = [</w:t>
+              <w:br/>
+              <w:t xml:space="preserve">    { id: 1, title: "Mechanical Keyboard", price: 85, category: "peripherals", inStock: true },</w:t>
+              <w:br/>
+              <w:t xml:space="preserve">    { id: 2, title: "USB-C Cable", price: 15, category: "cables", inStock: true },</w:t>
+              <w:br/>
+              <w:t xml:space="preserve">    { id: 3, title: "Gaming Mouse", price: 55, category: "peripherals", inStock: false },</w:t>
+              <w:br/>
+              <w:t xml:space="preserve">    { id: 4, title: "HDMI Cable", price: 25, category: "cables", inStock: true },</w:t>
+              <w:br/>
+              <w:t xml:space="preserve">    { id: 5, title: "Headphones", price: 120, category: "audio", inStock: true }</w:t>
+              <w:br/>
+              <w:t>];</w:t>
+              <w:br/>
+              <w:br/>
+              <w:t>// 1. inStock titles</w:t>
+              <w:br/>
+              <w:t>const inStock = products.filter((p) =&gt; p.inStock).map((p) =&gt; p.title);</w:t>
+              <w:br/>
+              <w:t>console.log("In stock:", inStock);</w:t>
+              <w:br/>
+              <w:br/>
+              <w:t>// 2. Total price</w:t>
+              <w:br/>
+              <w:t>const total = products.reduce((sum, p) =&gt; sum + p.price, 0);</w:t>
+              <w:br/>
+              <w:t>console.log("Total price:", total);</w:t>
+              <w:br/>
+              <w:br/>
+              <w:t>// 3. groupBy using reduce</w:t>
+              <w:br/>
+              <w:t>const groupBy = (arr, key) =&gt;</w:t>
+              <w:br/>
+              <w:t xml:space="preserve">    arr.reduce((acc, item) =&gt; {</w:t>
+              <w:br/>
+              <w:t xml:space="preserve">        const k = item[key];</w:t>
+              <w:br/>
+              <w:t xml:space="preserve">        if (!acc[k]) acc[k] = [];</w:t>
+              <w:br/>
+              <w:t xml:space="preserve">        acc[k].push(item);</w:t>
+              <w:br/>
+              <w:t xml:space="preserve">        return acc;</w:t>
+              <w:br/>
+              <w:t xml:space="preserve">    }, {});</w:t>
+              <w:br/>
+              <w:br/>
+              <w:t>console.log("Grouped by category:", groupBy(products, "category"));</w:t>
             </w:r>
           </w:p>
         </w:tc>
@@ -1158,7 +955,7 @@
           <w:color w:val="0A0A0A"/>
           <w:sz w:val="22"/>
         </w:rPr>
-        <w:t>7. Class Activity F &amp; Homework Task 4: Tip Calculator (calculator.js)</w:t>
+        <w:t>5. Class Activity F &amp; Homework Task 4: Tip Calculator (calculator.js)</w:t>
       </w:r>
     </w:p>
     <w:p>
@@ -1171,46 +968,7 @@
           <w:color w:val="1E1E1E"/>
           <w:sz w:val="19"/>
         </w:rPr>
-        <w:t>Authored calculateBill({ amount, tipPercent = 15, people = 1 }) with defensive type checking.</w:t>
-      </w:r>
-    </w:p>
-    <w:p>
-      <w:pPr>
-        <w:spacing w:before="0" w:after="80" w:line="276" w:lineRule="auto"/>
-      </w:pPr>
-      <w:r>
-        <w:rPr>
-          <w:rFonts w:ascii="Helvetica" w:hAnsi="Helvetica"/>
-          <w:color w:val="1E1E1E"/>
-          <w:sz w:val="19"/>
-        </w:rPr>
-        <w:t>Tested happy-path calculation (amount: 2400, tip: 10%, 3 persons -&gt; PKR 880 each).</w:t>
-      </w:r>
-    </w:p>
-    <w:p>
-      <w:pPr>
-        <w:spacing w:before="0" w:after="80" w:line="276" w:lineRule="auto"/>
-      </w:pPr>
-      <w:r>
-        <w:rPr>
-          <w:rFonts w:ascii="Helvetica" w:hAnsi="Helvetica"/>
-          <w:color w:val="1E1E1E"/>
-          <w:sz w:val="19"/>
-        </w:rPr>
-        <w:t>Protected against bad amount (-500), people: 0, and non-number tip percentages using try/catch.</w:t>
-      </w:r>
-    </w:p>
-    <w:p>
-      <w:pPr>
-        <w:spacing w:before="0" w:after="80" w:line="276" w:lineRule="auto"/>
-      </w:pPr>
-      <w:r>
-        <w:rPr>
-          <w:rFonts w:ascii="Helvetica" w:hAnsi="Helvetica"/>
-          <w:color w:val="1E1E1E"/>
-          <w:sz w:val="19"/>
-        </w:rPr>
-        <w:t>Implemented formatBill(result) helper returning a polished receipt block.</w:t>
+        <w:t>Wrote calculateBill with validation for amount, tip, and people. Wrapped error test cases in try/catch and added formatBill.</w:t>
       </w:r>
     </w:p>
     <w:p>
@@ -1258,26 +1016,39 @@
                 <w:color w:val="141414"/>
                 <w:sz w:val="16"/>
               </w:rPr>
-              <w:t>// calculator.js</w:t>
-              <w:br/>
-              <w:t>const calculateBill = ({ amount, tipPercent = 15, people = 1 } = {}) =&gt; {</w:t>
-              <w:br/>
-              <w:t xml:space="preserve">    if (typeof amount !== "number" || amount &lt;= 0) throw new Error("Invalid amount");</w:t>
-              <w:br/>
-              <w:t xml:space="preserve">    if (typeof tipPercent !== "number" || tipPercent &lt; 0) throw new Error("Invalid tip");</w:t>
-              <w:br/>
-              <w:t xml:space="preserve">    if (!Number.isInteger(people) || people &lt; 1) throw new Error("Invalid people");</w:t>
+              <w:t>// Class Activity F &amp; Homework Task 4</w:t>
+              <w:br/>
+              <w:t>function calculateBill({ amount, tipPercent = 15, people = 1 } = {}) {</w:t>
+              <w:br/>
+              <w:t xml:space="preserve">    if (typeof amount !== "number" || amount &lt;= 0) {</w:t>
+              <w:br/>
+              <w:t xml:space="preserve">        throw new Error("Amount must be a number greater than 0");</w:t>
+              <w:br/>
+              <w:t xml:space="preserve">    }</w:t>
+              <w:br/>
+              <w:t xml:space="preserve">    if (typeof tipPercent !== "number" || tipPercent &lt; 0) {</w:t>
+              <w:br/>
+              <w:t xml:space="preserve">        throw new Error("Tip percentage must be a valid non-negative number");</w:t>
+              <w:br/>
+              <w:t xml:space="preserve">    }</w:t>
+              <w:br/>
+              <w:t xml:space="preserve">    if (!Number.isInteger(people) || people &lt; 1) {</w:t>
+              <w:br/>
+              <w:t xml:space="preserve">        throw new Error("People must be an integer of 1 or more");</w:t>
+              <w:br/>
+              <w:t xml:space="preserve">    }</w:t>
               <w:br/>
               <w:br/>
               <w:t xml:space="preserve">    const tipAmount = amount * (tipPercent / 100);</w:t>
               <w:br/>
               <w:t xml:space="preserve">    const totalAmount = amount + tipAmount;</w:t>
               <w:br/>
+              <w:br/>
               <w:t xml:space="preserve">    return {</w:t>
               <w:br/>
               <w:t xml:space="preserve">        amount: Number(amount.toFixed(2)),</w:t>
               <w:br/>
-              <w:t xml:space="preserve">        tipPercent: Number(tipPercent.toFixed(2)),</w:t>
+              <w:t xml:space="preserve">        tipPercent,</w:t>
               <w:br/>
               <w:t xml:space="preserve">        tipAmount: Number(tipAmount.toFixed(2)),</w:t>
               <w:br/>
@@ -1289,7 +1060,58 @@
               <w:br/>
               <w:t xml:space="preserve">    };</w:t>
               <w:br/>
-              <w:t>};</w:t>
+              <w:t>}</w:t>
+              <w:br/>
+              <w:br/>
+              <w:t>function formatBill(b) {</w:t>
+              <w:br/>
+              <w:t xml:space="preserve">    return `Subtotal: PKR ${b.amount}\nTip (${b.tipPercent}%): PKR ${b.tipAmount}\nTotal: PKR ${b.totalAmount}\nPeople: ${b.people}\nPer person: PKR ${b.perPerson}`;</w:t>
+              <w:br/>
+              <w:t>}</w:t>
+              <w:br/>
+              <w:br/>
+              <w:t>// Happy path</w:t>
+              <w:br/>
+              <w:t>const bill = calculateBill({ amount: 2400, tipPercent: 10, people: 3 });</w:t>
+              <w:br/>
+              <w:t>console.log(bill);</w:t>
+              <w:br/>
+              <w:t>console.log(formatBill(bill));</w:t>
+              <w:br/>
+              <w:br/>
+              <w:t>// Error tests</w:t>
+              <w:br/>
+              <w:t>try {</w:t>
+              <w:br/>
+              <w:t xml:space="preserve">    calculateBill({ amount: -100, tipPercent: 10, people: 2 });</w:t>
+              <w:br/>
+              <w:t>} catch (e) {</w:t>
+              <w:br/>
+              <w:t xml:space="preserve">    console.log("Caught:", e.message);</w:t>
+              <w:br/>
+              <w:t>}</w:t>
+              <w:br/>
+              <w:br/>
+              <w:t>try {</w:t>
+              <w:br/>
+              <w:t xml:space="preserve">    calculateBill({ amount: 1500, tipPercent: 10, people: 0 });</w:t>
+              <w:br/>
+              <w:t>} catch (e) {</w:t>
+              <w:br/>
+              <w:t xml:space="preserve">    console.log("Caught:", e.message);</w:t>
+              <w:br/>
+              <w:t>}</w:t>
+              <w:br/>
+              <w:br/>
+              <w:t>try {</w:t>
+              <w:br/>
+              <w:t xml:space="preserve">    calculateBill({ amount: 1000, tipPercent: "ten", people: 2 });</w:t>
+              <w:br/>
+              <w:t>} catch (e) {</w:t>
+              <w:br/>
+              <w:t xml:space="preserve">    console.log("Caught:", e.message);</w:t>
+              <w:br/>
+              <w:t>}</w:t>
             </w:r>
           </w:p>
         </w:tc>
@@ -1312,7 +1134,7 @@
           <w:color w:val="0A0A0A"/>
           <w:sz w:val="22"/>
         </w:rPr>
-        <w:t>8. In-Class Lab Consolidated Script (lab.js)</w:t>
+        <w:t>6. In-Class Lab: Finish Fundamentals (lab.js)</w:t>
       </w:r>
     </w:p>
     <w:p>
@@ -1325,7 +1147,7 @@
           <w:color w:val="1E1E1E"/>
           <w:sz w:val="19"/>
         </w:rPr>
-        <w:t>Consolidated all five core fundamentals into one clean script (lab.js) that runs with node and executes without errors.</w:t>
+        <w:t>Combined all lab requirements into one file. Runs with node without errors.</w:t>
       </w:r>
     </w:p>
     <w:p>
@@ -1373,21 +1195,165 @@
                 <w:color w:val="141414"/>
                 <w:sz w:val="16"/>
               </w:rPr>
-              <w:t>// lab.js summary execution</w:t>
-              <w:br/>
-              <w:t>node lab.js</w:t>
-              <w:br/>
-              <w:t>All checklist criteria satisfied:</w:t>
-              <w:br/>
-              <w:t>[x] getInitials, isPalindrome, countWords</w:t>
-              <w:br/>
-              <w:t>[x] Above-average students via array methods (no loops)</w:t>
-              <w:br/>
-              <w:t>[x] groupBy(products, "category") via reduce</w:t>
-              <w:br/>
-              <w:t>[x] calculateBill with input validation + try/catch error tests</w:t>
-              <w:br/>
-              <w:t>[x] const / let / === / ?? strictly followed</w:t>
+              <w:t>// In-Class Lab: Finish the Fundamentals File (lab.js)</w:t>
+              <w:br/>
+              <w:br/>
+              <w:t>// 1. Helpers</w:t>
+              <w:br/>
+              <w:t>const getInitials = (name) =&gt;</w:t>
+              <w:br/>
+              <w:t xml:space="preserve">    name.trim().split(/\s+/).map((w) =&gt; w[0].toUpperCase()).join("");</w:t>
+              <w:br/>
+              <w:br/>
+              <w:t>const isPalindrome = (str) =&gt; {</w:t>
+              <w:br/>
+              <w:t xml:space="preserve">    const s = str.toLowerCase().replace(/[^a-z0-9]/g, "");</w:t>
+              <w:br/>
+              <w:t xml:space="preserve">    return s.length &gt; 0 &amp;&amp; s === s.split("").reverse().join("");</w:t>
+              <w:br/>
+              <w:t>};</w:t>
+              <w:br/>
+              <w:br/>
+              <w:t>const countWords = (str) =&gt;</w:t>
+              <w:br/>
+              <w:t xml:space="preserve">    str.trim() === "" ? 0 : str.trim().split(/\s+/).length;</w:t>
+              <w:br/>
+              <w:br/>
+              <w:t>console.log("Initials:", getInitials("Ayesha Khan"));</w:t>
+              <w:br/>
+              <w:t>console.log("Palindrome:", isPalindrome("Race car"));</w:t>
+              <w:br/>
+              <w:t>console.log("Words:", countWords("the quick brown fox"));</w:t>
+              <w:br/>
+              <w:br/>
+              <w:t>// 2. Above-average students (no loops)</w:t>
+              <w:br/>
+              <w:t>const students = [</w:t>
+              <w:br/>
+              <w:t xml:space="preserve">    { name: "Ali", score: 82 },</w:t>
+              <w:br/>
+              <w:t xml:space="preserve">    { name: "Sara", score: 95 },</w:t>
+              <w:br/>
+              <w:t xml:space="preserve">    { name: "Ahmed", score: 68 },</w:t>
+              <w:br/>
+              <w:t xml:space="preserve">    { name: "Zainab", score: 77 },</w:t>
+              <w:br/>
+              <w:t xml:space="preserve">    { name: "Bilal", score: 91 },</w:t>
+              <w:br/>
+              <w:t xml:space="preserve">    { name: "Hamza", score: 45 }</w:t>
+              <w:br/>
+              <w:t>];</w:t>
+              <w:br/>
+              <w:t>const avg = students.reduce((sum, s) =&gt; sum + s.score, 0) / students.length;</w:t>
+              <w:br/>
+              <w:t>const aboveAvg = students.filter((s) =&gt; s.score &gt; avg).map((s) =&gt; s.name);</w:t>
+              <w:br/>
+              <w:t>console.log("Average:", avg.toFixed(2));</w:t>
+              <w:br/>
+              <w:t>console.log("Above Average:", aboveAvg);</w:t>
+              <w:br/>
+              <w:br/>
+              <w:t>// 3. groupBy using reduce</w:t>
+              <w:br/>
+              <w:t>const products = [</w:t>
+              <w:br/>
+              <w:t xml:space="preserve">    { title: "Keyboard", category: "peripherals" },</w:t>
+              <w:br/>
+              <w:t xml:space="preserve">    { title: "Mouse", category: "peripherals" },</w:t>
+              <w:br/>
+              <w:t xml:space="preserve">    { title: "USB Cable", category: "cables" }</w:t>
+              <w:br/>
+              <w:t>];</w:t>
+              <w:br/>
+              <w:t>const groupBy = (arr, key) =&gt;</w:t>
+              <w:br/>
+              <w:t xml:space="preserve">    arr.reduce((acc, item) =&gt; {</w:t>
+              <w:br/>
+              <w:t xml:space="preserve">        (acc[item[key]] = acc[item[key]] || []).push(item);</w:t>
+              <w:br/>
+              <w:t xml:space="preserve">        return acc;</w:t>
+              <w:br/>
+              <w:t xml:space="preserve">    }, {});</w:t>
+              <w:br/>
+              <w:t>console.log("Grouped:", groupBy(products, "category"));</w:t>
+              <w:br/>
+              <w:br/>
+              <w:t>// 4. calculateBill with validation + passing test for each error case</w:t>
+              <w:br/>
+              <w:t>function calculateBill({ amount, tipPercent = 15, people = 1 } = {}) {</w:t>
+              <w:br/>
+              <w:t xml:space="preserve">    if (typeof amount !== "number" || amount &lt;= 0) {</w:t>
+              <w:br/>
+              <w:t xml:space="preserve">        throw new Error("Invalid amount");</w:t>
+              <w:br/>
+              <w:t xml:space="preserve">    }</w:t>
+              <w:br/>
+              <w:t xml:space="preserve">    if (typeof tipPercent !== "number" || tipPercent &lt; 0) {</w:t>
+              <w:br/>
+              <w:t xml:space="preserve">        throw new Error("Invalid tip percentage");</w:t>
+              <w:br/>
+              <w:t xml:space="preserve">    }</w:t>
+              <w:br/>
+              <w:t xml:space="preserve">    if (!Number.isInteger(people) || people &lt; 1) {</w:t>
+              <w:br/>
+              <w:t xml:space="preserve">        throw new Error("Invalid people count");</w:t>
+              <w:br/>
+              <w:t xml:space="preserve">    }</w:t>
+              <w:br/>
+              <w:br/>
+              <w:t xml:space="preserve">    const tip = amount * (tipPercent / 100);</w:t>
+              <w:br/>
+              <w:t xml:space="preserve">    const total = amount + tip;</w:t>
+              <w:br/>
+              <w:t xml:space="preserve">    return {</w:t>
+              <w:br/>
+              <w:t xml:space="preserve">        amount,</w:t>
+              <w:br/>
+              <w:t xml:space="preserve">        tipPercent,</w:t>
+              <w:br/>
+              <w:t xml:space="preserve">        total: Number(total.toFixed(2)),</w:t>
+              <w:br/>
+              <w:t xml:space="preserve">        perPerson: Number((total / people).toFixed(2))</w:t>
+              <w:br/>
+              <w:t xml:space="preserve">    };</w:t>
+              <w:br/>
+              <w:t>}</w:t>
+              <w:br/>
+              <w:br/>
+              <w:t>console.log("Bill:", calculateBill({ amount: 2400, tipPercent: 10, people: 3 }));</w:t>
+              <w:br/>
+              <w:br/>
+              <w:t>try {</w:t>
+              <w:br/>
+              <w:t xml:space="preserve">    calculateBill({ amount: -50, people: 2 });</w:t>
+              <w:br/>
+              <w:t>} catch (e) {</w:t>
+              <w:br/>
+              <w:t xml:space="preserve">    console.log("Caught:", e.message);</w:t>
+              <w:br/>
+              <w:t>}</w:t>
+              <w:br/>
+              <w:br/>
+              <w:t>try {</w:t>
+              <w:br/>
+              <w:t xml:space="preserve">    calculateBill({ amount: 1000, people: 0 });</w:t>
+              <w:br/>
+              <w:t>} catch (e) {</w:t>
+              <w:br/>
+              <w:t xml:space="preserve">    console.log("Caught:", e.message);</w:t>
+              <w:br/>
+              <w:t>}</w:t>
+              <w:br/>
+              <w:br/>
+              <w:t>try {</w:t>
+              <w:br/>
+              <w:t xml:space="preserve">    calculateBill({ amount: 1000, tipPercent: "ten", people: 2 });</w:t>
+              <w:br/>
+              <w:t>} catch (e) {</w:t>
+              <w:br/>
+              <w:t xml:space="preserve">    console.log("Caught:", e.message);</w:t>
+              <w:br/>
+              <w:t>}</w:t>
             </w:r>
           </w:p>
         </w:tc>
@@ -1410,7 +1376,7 @@
           <w:color w:val="0A0A0A"/>
           <w:sz w:val="22"/>
         </w:rPr>
-        <w:t>9. Homework Task 1: Gradebook Analysis (gradebook.js)</w:t>
+        <w:t>7. Homework Task 1: Gradebook Script (gradebook.js)</w:t>
       </w:r>
     </w:p>
     <w:p>
@@ -1423,20 +1389,7 @@
           <w:color w:val="1E1E1E"/>
           <w:sz w:val="19"/>
         </w:rPr>
-        <w:t>Wrote gradebook.js using strictly array methods (reduce, filter, map, sort).</w:t>
-      </w:r>
-    </w:p>
-    <w:p>
-      <w:pPr>
-        <w:spacing w:before="0" w:after="80" w:line="276" w:lineRule="auto"/>
-      </w:pPr>
-      <w:r>
-        <w:rPr>
-          <w:rFonts w:ascii="Helvetica" w:hAnsi="Helvetica"/>
-          <w:color w:val="1E1E1E"/>
-          <w:sz w:val="19"/>
-        </w:rPr>
-        <w:t>Outputs: Class average (73.00), Highest scorer (Muhammad Tayyab, 94), Lowest scorer (Dua Malik, 42), Pass rate (75.00%), and complete descending rankings.</w:t>
+        <w:t>Calculated class average, highest/lowest scorer, pass rate, and sorted ranking using only array methods.</w:t>
       </w:r>
     </w:p>
     <w:p>
@@ -1484,15 +1437,51 @@
                 <w:color w:val="141414"/>
                 <w:sz w:val="16"/>
               </w:rPr>
-              <w:t>// gradebook.js</w:t>
-              <w:br/>
-              <w:t>const avg = gradebook.reduce((sum, s) =&gt; sum + s.score, 0) / gradebook.length;</w:t>
-              <w:br/>
-              <w:t>const highest = gradebook.reduce((max, s) =&gt; s.score &gt; max.score ? s : max);</w:t>
-              <w:br/>
-              <w:t>const lowest = gradebook.reduce((min, s) =&gt; s.score &lt; min.score ? s : min);</w:t>
-              <w:br/>
-              <w:t>const passRate = (gradebook.filter(s =&gt; s.score &gt;= 50).length / gradebook.length) * 100;</w:t>
+              <w:t>// Homework Task 1: Gradebook Script</w:t>
+              <w:br/>
+              <w:t>const students = [</w:t>
+              <w:br/>
+              <w:t xml:space="preserve">    { name: "Muhammad Tayyab", score: 94 },</w:t>
+              <w:br/>
+              <w:t xml:space="preserve">    { name: "Ayesha Khan", score: 88 },</w:t>
+              <w:br/>
+              <w:t xml:space="preserve">    { name: "Bilal Ahmed", score: 76 },</w:t>
+              <w:br/>
+              <w:t xml:space="preserve">    { name: "Zainab Fatima", score: 91 },</w:t>
+              <w:br/>
+              <w:t xml:space="preserve">    { name: "Hamza Tariq", score: 48 },</w:t>
+              <w:br/>
+              <w:t xml:space="preserve">    { name: "Sara Noor", score: 83 },</w:t>
+              <w:br/>
+              <w:t xml:space="preserve">    { name: "Usman Ali", score: 62 },</w:t>
+              <w:br/>
+              <w:t xml:space="preserve">    { name: "Dua Malik", score: 42 }</w:t>
+              <w:br/>
+              <w:t>];</w:t>
+              <w:br/>
+              <w:br/>
+              <w:t>const total = students.reduce((sum, s) =&gt; sum + s.score, 0);</w:t>
+              <w:br/>
+              <w:t>const avg = total / students.length;</w:t>
+              <w:br/>
+              <w:t>const highest = students.reduce((max, s) =&gt; (s.score &gt; max.score ? s : max));</w:t>
+              <w:br/>
+              <w:t>const lowest = students.reduce((min, s) =&gt; (s.score &lt; min.score ? s : min));</w:t>
+              <w:br/>
+              <w:t>const passRate = (students.filter((s) =&gt; s.score &gt;= 50).length / students.length) * 100;</w:t>
+              <w:br/>
+              <w:t>const sorted = [...students].sort((a, b) =&gt; b.score - a.score);</w:t>
+              <w:br/>
+              <w:br/>
+              <w:t>console.log("Class Average:", avg);</w:t>
+              <w:br/>
+              <w:t>console.log("Highest Scorer:", highest.name, `(${highest.score})`);</w:t>
+              <w:br/>
+              <w:t>console.log("Lowest Scorer:", lowest.name, `(${lowest.score})`);</w:t>
+              <w:br/>
+              <w:t>console.log("Pass Rate:", `${passRate}%`);</w:t>
+              <w:br/>
+              <w:t>console.log("Sorted:", sorted.map((s) =&gt; `${s.name}: ${s.score}`));</w:t>
             </w:r>
           </w:p>
         </w:tc>
@@ -1515,7 +1504,7 @@
           <w:color w:val="0A0A0A"/>
           <w:sz w:val="22"/>
         </w:rPr>
-        <w:t>10. Homework Task 2: Predict Before You Run (predict.txt / predict.js)</w:t>
+        <w:t>8. Homework Task 2: Predict Before You Run (predict.txt)</w:t>
       </w:r>
     </w:p>
     <w:p>
@@ -1528,8 +1517,145 @@
           <w:color w:val="1E1E1E"/>
           <w:sz w:val="19"/>
         </w:rPr>
-        <w:t>Detailed predictions vs actual outcomes for JavaScript coercion, nullish coalescing, and sorting quirks in predict.txt and predict.js.</w:t>
+        <w:t>Predictions and actual outputs for loose equality, strict equality, type coercion, and array sorting.</w:t>
       </w:r>
+    </w:p>
+    <w:p>
+      <w:pPr>
+        <w:spacing w:before="80" w:after="20"/>
+      </w:pPr>
+      <w:r>
+        <w:rPr>
+          <w:b/>
+          <w:color w:val="505050"/>
+          <w:sz w:val="16"/>
+        </w:rPr>
+        <w:t>File: Week 5/predict.txt</w:t>
+      </w:r>
+    </w:p>
+    <w:tbl>
+      <w:tblPr>
+        <w:tblW w:type="auto" w:w="0"/>
+        <w:jc w:val="center"/>
+        <w:tblLayout w:type="fixed"/>
+        <w:tblLook w:firstColumn="1" w:firstRow="1" w:lastColumn="0" w:lastRow="0" w:noHBand="0" w:noVBand="1" w:val="04A0"/>
+      </w:tblPr>
+      <w:tblGrid>
+        <w:gridCol w:w="10800"/>
+      </w:tblGrid>
+      <w:tr>
+        <w:tc>
+          <w:tcPr>
+            <w:tcW w:type="dxa" w:w="9360"/>
+            <w:shd w:fill="F5F5F5"/>
+            <w:tcMar>
+              <w:top w:w="80" w:type="dxa"/>
+              <w:bottom w:w="80" w:type="dxa"/>
+              <w:left w:w="120" w:type="dxa"/>
+              <w:right w:w="120" w:type="dxa"/>
+            </w:tcMar>
+          </w:tcPr>
+          <w:p>
+            <w:pPr>
+              <w:spacing w:before="0" w:after="0" w:line="252" w:lineRule="auto"/>
+            </w:pPr>
+            <w:r>
+              <w:rPr>
+                <w:rFonts w:ascii="Courier New" w:hAnsi="Courier New"/>
+                <w:color w:val="141414"/>
+                <w:sz w:val="16"/>
+              </w:rPr>
+              <w:t>Task 2 Predictions and Explanations</w:t>
+              <w:br/>
+              <w:br/>
+              <w:t>1. 0 == false</w:t>
+              <w:br/>
+              <w:t>Prediction: true</w:t>
+              <w:br/>
+              <w:t>Output: true</w:t>
+              <w:br/>
+              <w:t>Reason: Loose equality coerces false to 0, so 0 == 0.</w:t>
+              <w:br/>
+              <w:br/>
+              <w:t>2. 0 === false</w:t>
+              <w:br/>
+              <w:t>Prediction: false</w:t>
+              <w:br/>
+              <w:t>Output: false</w:t>
+              <w:br/>
+              <w:t>Reason: Strict equality checks type without coercion (number !== boolean).</w:t>
+              <w:br/>
+              <w:br/>
+              <w:t>3. [] == false</w:t>
+              <w:br/>
+              <w:t>Prediction: true</w:t>
+              <w:br/>
+              <w:t>Output: true</w:t>
+              <w:br/>
+              <w:t>Reason: [] converts to "" which coerces to 0, so 0 == 0.</w:t>
+              <w:br/>
+              <w:br/>
+              <w:t>4. [] == ![]</w:t>
+              <w:br/>
+              <w:t>Prediction: true</w:t>
+              <w:br/>
+              <w:t>Output: true</w:t>
+              <w:br/>
+              <w:t>Reason: ![] is false because arrays are truthy. Then [] == false becomes true.</w:t>
+              <w:br/>
+              <w:br/>
+              <w:t>5. null == undefined</w:t>
+              <w:br/>
+              <w:t>Prediction: true</w:t>
+              <w:br/>
+              <w:t>Output: true</w:t>
+              <w:br/>
+              <w:t>Reason: In JavaScript null and undefined are loosely equal by specification.</w:t>
+              <w:br/>
+              <w:br/>
+              <w:t>6. null === undefined</w:t>
+              <w:br/>
+              <w:t>Prediction: false</w:t>
+              <w:br/>
+              <w:t>Output: false</w:t>
+              <w:br/>
+              <w:t>Reason: Different types (null vs undefined).</w:t>
+              <w:br/>
+              <w:br/>
+              <w:t>7. typeof NaN</w:t>
+              <w:br/>
+              <w:t>Prediction: number</w:t>
+              <w:br/>
+              <w:t>Output: number</w:t>
+              <w:br/>
+              <w:t>Reason: In JS, NaN is still classified as a numeric type.</w:t>
+              <w:br/>
+              <w:br/>
+              <w:t>8. 0 || 42 vs 0 ?? 42</w:t>
+              <w:br/>
+              <w:t>Prediction: 42 vs 0</w:t>
+              <w:br/>
+              <w:t>Output: 42 vs 0</w:t>
+              <w:br/>
+              <w:t>Reason: || treats 0 as falsy, but ?? only checks for null or undefined.</w:t>
+              <w:br/>
+              <w:br/>
+              <w:t>9. [10, 2, 5, 1].sort()</w:t>
+              <w:br/>
+              <w:t>Prediction: [1, 10, 2, 5]</w:t>
+              <w:br/>
+              <w:t>Output: [1, 10, 2, 5]</w:t>
+              <w:br/>
+              <w:t>Reason: Default sort converts elements to strings and sorts alphabetically ("10" comes before "2").</w:t>
+            </w:r>
+          </w:p>
+        </w:tc>
+      </w:tr>
+    </w:tbl>
+    <w:p>
+      <w:pPr>
+        <w:spacing w:after="80"/>
+      </w:pPr>
     </w:p>
     <w:p>
       <w:pPr>
@@ -1543,7 +1669,7 @@
           <w:color w:val="0A0A0A"/>
           <w:sz w:val="22"/>
         </w:rPr>
-        <w:t>11. Homework Task 3: freeCodeCamp Basic JavaScript Verification</w:t>
+        <w:t>9. Homework Task 3: freeCodeCamp Practice (freecodecamp.md)</w:t>
       </w:r>
     </w:p>
     <w:p>
@@ -1556,7 +1682,7 @@
           <w:color w:val="1E1E1E"/>
           <w:sz w:val="19"/>
         </w:rPr>
-        <w:t>Completed the Basic JavaScript section (113 challenges) on freeCodeCamp, documenting mastery over ES6 syntax, objects, functions, and recursion in freecodecamp.md.</w:t>
+        <w:t>Completed the 113 exercises in the Basic JavaScript section of freeCodeCamp covering variables, arrays, objects, functions, loops, and recursion.</w:t>
       </w:r>
     </w:p>
     <w:sectPr>

</xml_diff>

<commit_message>
skip freeCodeCamp task and update week 5 submission pdf/docx
</commit_message>
<xml_diff>
--- a/submissions/Muhammad_Tayyab_023-24-0118_Week_05_Lab_Submission.docx
+++ b/submissions/Muhammad_Tayyab_023-24-0118_Week_05_Lab_Submission.docx
@@ -1657,34 +1657,6 @@
         <w:spacing w:after="80"/>
       </w:pPr>
     </w:p>
-    <w:p>
-      <w:pPr>
-        <w:keepNext/>
-        <w:spacing w:before="240" w:after="80"/>
-      </w:pPr>
-      <w:r>
-        <w:rPr>
-          <w:rFonts w:ascii="Helvetica" w:hAnsi="Helvetica"/>
-          <w:b/>
-          <w:color w:val="0A0A0A"/>
-          <w:sz w:val="22"/>
-        </w:rPr>
-        <w:t>9. Homework Task 3: freeCodeCamp Practice (freecodecamp.md)</w:t>
-      </w:r>
-    </w:p>
-    <w:p>
-      <w:pPr>
-        <w:spacing w:before="0" w:after="80" w:line="276" w:lineRule="auto"/>
-      </w:pPr>
-      <w:r>
-        <w:rPr>
-          <w:rFonts w:ascii="Helvetica" w:hAnsi="Helvetica"/>
-          <w:color w:val="1E1E1E"/>
-          <w:sz w:val="19"/>
-        </w:rPr>
-        <w:t>Completed the 113 exercises in the Basic JavaScript section of freeCodeCamp covering variables, arrays, objects, functions, loops, and recursion.</w:t>
-      </w:r>
-    </w:p>
     <w:sectPr>
       <w:headerReference w:type="default" r:id="rId9"/>
       <w:footerReference w:type="default" r:id="rId10"/>

</xml_diff>

<commit_message>
remove 'submitted to' field from week 5 submission cover page
</commit_message>
<xml_diff>
--- a/submissions/Muhammad_Tayyab_023-24-0118_Week_05_Lab_Submission.docx
+++ b/submissions/Muhammad_Tayyab_023-24-0118_Week_05_Lab_Submission.docx
@@ -289,58 +289,6 @@
                 <w:sz w:val="19"/>
               </w:rPr>
               <w:t>5th Semester (Fall 2026)</w:t>
-            </w:r>
-          </w:p>
-        </w:tc>
-      </w:tr>
-      <w:tr>
-        <w:tc>
-          <w:tcPr>
-            <w:tcW w:type="dxa" w:w="2880"/>
-            <w:shd w:fill="F8F8F8"/>
-            <w:tcMar>
-              <w:top w:w="60" w:type="dxa"/>
-              <w:bottom w:w="60" w:type="dxa"/>
-              <w:left w:w="100" w:type="dxa"/>
-              <w:right w:w="100" w:type="dxa"/>
-            </w:tcMar>
-          </w:tcPr>
-          <w:p>
-            <w:pPr>
-              <w:spacing w:before="0" w:after="0"/>
-            </w:pPr>
-            <w:r>
-              <w:rPr>
-                <w:rFonts w:ascii="Helvetica" w:hAnsi="Helvetica"/>
-                <w:b/>
-                <w:sz w:val="19"/>
-              </w:rPr>
-              <w:t>Submitted To:</w:t>
-            </w:r>
-          </w:p>
-        </w:tc>
-        <w:tc>
-          <w:tcPr>
-            <w:tcW w:type="dxa" w:w="6480"/>
-            <w:shd w:fill="F8F8F8"/>
-            <w:tcMar>
-              <w:top w:w="60" w:type="dxa"/>
-              <w:bottom w:w="60" w:type="dxa"/>
-              <w:left w:w="100" w:type="dxa"/>
-              <w:right w:w="100" w:type="dxa"/>
-            </w:tcMar>
-          </w:tcPr>
-          <w:p>
-            <w:pPr>
-              <w:spacing w:before="0" w:after="0"/>
-            </w:pPr>
-            <w:r>
-              <w:rPr>
-                <w:rFonts w:ascii="Helvetica" w:hAnsi="Helvetica"/>
-                <w:color w:val="1E1E1E"/>
-                <w:sz w:val="19"/>
-              </w:rPr>
-              <w:t>Lab Instructor</w:t>
             </w:r>
           </w:p>
         </w:tc>

</xml_diff>